<commit_message>
Update case study and README to post-A1 numbers
Case study and README were still showing the pre-A1 run (23.5M total,
294 flagged SKUs, 18.8M releasable across 191 SKUs, 84 tests). Updated
to the current live figures: 21.2M total / 280 flagged / 16.5M
releasable across 173 SKUs / 88 tests run by default, and added the
A2 upper-bound caveat (six SKUs counted under both the excess and
expiry clusters, since each names a distinct action on the same
units).

Co-Authored-By: Claude Sonnet 5 <noreply@anthropic.com>
</commit_message>
<xml_diff>
--- a/docs/Liquidity_Lens_Case_Study.docx
+++ b/docs/Liquidity_Lens_Case_Study.docx
@@ -147,7 +147,7 @@
           <w:sz w:val="20"/>
           <w:szCs w:val="20"/>
         </w:rPr>
-        <w:t xml:space="preserve">The diagnostic segments SKUs by ABC-XYZ classification, computes target inventory levels using a periodic-review order-up-to model calibrated to each SKU’s lead time and demand variability, and identifies three risk clusters: excess cash that is safe to release, expiry exposure that requires triage, and stockout risk that requires replenishment.</w:t>
+        <w:t xml:space="preserve">The diagnostic segments SKUs by ABC-XYZ classification, computes target inventory levels using a periodic-review order-up-to model calibrated to each SKU’s lead time, demand variability, and service-level target, and identifies three risk clusters: excess cash that is safe to release, expiry exposure that requires triage, and stockout risk that requires replenishment.</w:t>
       </w:r>
     </w:p>
     <w:p>
@@ -189,7 +189,7 @@
           <w:sz w:val="20"/>
           <w:szCs w:val="20"/>
         </w:rPr>
-        <w:t xml:space="preserve">AED 23.5M</w:t>
+        <w:t xml:space="preserve">AED 21.2M</w:t>
       </w:r>
       <w:r>
         <w:rPr>
@@ -198,7 +198,7 @@
           <w:sz w:val="20"/>
           <w:szCs w:val="20"/>
         </w:rPr>
-        <w:t xml:space="preserve"> across 294 of 600 SKUs, representing </w:t>
+        <w:t xml:space="preserve"> across 280 of 600 SKUs, representing </w:t>
       </w:r>
       <w:r>
         <w:rPr>
@@ -209,7 +209,7 @@
           <w:sz w:val="20"/>
           <w:szCs w:val="20"/>
         </w:rPr>
-        <w:t xml:space="preserve">22%</w:t>
+        <w:t xml:space="preserve">20%</w:t>
       </w:r>
       <w:r>
         <w:rPr>
@@ -218,7 +218,7 @@
           <w:sz w:val="20"/>
           <w:szCs w:val="20"/>
         </w:rPr>
-        <w:t xml:space="preserve"> of portfolio value.</w:t>
+        <w:t xml:space="preserve"> of portfolio value. The total is an upper bound across three risk dimensions; a small overlap exists where near-expiry items also qualify as excess.</w:t>
       </w:r>
     </w:p>
     <w:p>
@@ -451,7 +451,7 @@
                 <w:sz w:val="19"/>
                 <w:szCs w:val="19"/>
               </w:rPr>
-              <w:t xml:space="preserve">18,819,465</w:t>
+              <w:t xml:space="preserve">16,481,193</w:t>
             </w:r>
           </w:p>
         </w:tc>
@@ -485,7 +485,7 @@
                 <w:sz w:val="19"/>
                 <w:szCs w:val="19"/>
               </w:rPr>
-              <w:t xml:space="preserve">191</w:t>
+              <w:t xml:space="preserve">173</w:t>
             </w:r>
           </w:p>
         </w:tc>
@@ -836,7 +836,7 @@
                 <w:sz w:val="19"/>
                 <w:szCs w:val="19"/>
               </w:rPr>
-              <w:t xml:space="preserve">Total value at stake</w:t>
+              <w:t xml:space="preserve">Total (upper bound)*</w:t>
             </w:r>
           </w:p>
         </w:tc>
@@ -871,7 +871,7 @@
                 <w:sz w:val="19"/>
                 <w:szCs w:val="19"/>
               </w:rPr>
-              <w:t xml:space="preserve">23,519,704</w:t>
+              <w:t xml:space="preserve">21,181,432</w:t>
             </w:r>
           </w:p>
         </w:tc>
@@ -906,7 +906,7 @@
                 <w:sz w:val="19"/>
                 <w:szCs w:val="19"/>
               </w:rPr>
-              <w:t xml:space="preserve">294</w:t>
+              <w:t xml:space="preserve">280</w:t>
             </w:r>
           </w:p>
         </w:tc>
@@ -949,8 +949,24 @@
     </w:tbl>
     <w:p>
       <w:pPr>
-        <w:spacing w:after="80"/>
-      </w:pPr>
+        <w:spacing w:after="60"/>
+      </w:pPr>
+    </w:p>
+    <w:p>
+      <w:pPr>
+        <w:spacing w:after="140" w:line="260"/>
+      </w:pPr>
+      <w:r>
+        <w:rPr>
+          <w:rFonts w:ascii="Arial" w:cs="Arial" w:eastAsia="Arial" w:hAnsi="Arial"/>
+          <w:i/>
+          <w:iCs/>
+          <w:color w:val="777777"/>
+          <w:sz w:val="18"/>
+          <w:szCs w:val="18"/>
+        </w:rPr>
+        <w:t xml:space="preserve">*Total is an upper bound. Six SKUs appear in both the excess and expiry clusters, representing mutually exclusive actions on the same units (release vs write-off). The independently actionable pool is slightly lower.</w:t>
+      </w:r>
     </w:p>
     <w:p>
       <w:pPr>
@@ -982,7 +998,7 @@
           <w:sz w:val="20"/>
           <w:szCs w:val="20"/>
         </w:rPr>
-        <w:t xml:space="preserve">Excess inventory (AED 18.8M). </w:t>
+        <w:t xml:space="preserve">Excess inventory (AED 16.5M). </w:t>
       </w:r>
       <w:r>
         <w:rPr>
@@ -991,7 +1007,7 @@
           <w:sz w:val="20"/>
           <w:szCs w:val="20"/>
         </w:rPr>
-        <w:t xml:space="preserve">Supplier minimum order quantities are set at levels that deliver 6–12 months of cover per order for C·Z items (low value, unpredictable demand) that sell a few units per month. The target coverage level accounts for lead time, review period, and demand variability. Everything above it is releasable without service-level risk.</w:t>
+        <w:t xml:space="preserve">Supplier minimum order quantities are set at levels that deliver 6–12 months of cover per order for C·Z items (low value, unpredictable demand) that sell a few units per month. The target coverage level accounts for lead time, review period, and demand variability (safety stock scaled by coefficient of variation). Everything above the order-up-to level is releasable without service-level risk.</w:t>
       </w:r>
     </w:p>
     <w:p>
@@ -1255,7 +1271,7 @@
                 <w:sz w:val="19"/>
                 <w:szCs w:val="19"/>
               </w:rPr>
-              <w:t xml:space="preserve">18,819,465</w:t>
+              <w:t xml:space="preserve">16,481,193</w:t>
             </w:r>
           </w:p>
         </w:tc>
@@ -1288,7 +1304,7 @@
                 <w:sz w:val="19"/>
                 <w:szCs w:val="19"/>
               </w:rPr>
-              <w:t xml:space="preserve">Authorise return-to-vendor and markdowns for 191 safe-to-release SKUs. Renegotiate MOQs with Peninsula, Levant, Sino-Gulf.</w:t>
+              <w:t xml:space="preserve">Authorise return-to-vendor and markdowns for safe-to-release SKUs. Renegotiate MOQs with Peninsula, Levant, Sino-Gulf.</w:t>
             </w:r>
           </w:p>
         </w:tc>
@@ -1493,7 +1509,7 @@
                 <w:sz w:val="19"/>
                 <w:szCs w:val="19"/>
               </w:rPr>
-              <w:t xml:space="preserve">Expedite replenishment for 84 stockout-risk SKUs. Dual-sourcing and air freight. Do not release stock.</w:t>
+              <w:t xml:space="preserve">Expedite replenishment for stockout-risk SKUs. Dual-sourcing and air freight. Do not release stock.</w:t>
             </w:r>
           </w:p>
         </w:tc>
@@ -1515,7 +1531,7 @@
           <w:sz w:val="20"/>
           <w:szCs w:val="20"/>
         </w:rPr>
-        <w:t xml:space="preserve">The CFO should prioritise unlocking AED 18.8M in working capital as the immediate cash-flow action. The COO coordinates parallel tracks on expiry triage and stockout replenishment to protect margin. All three tracks run simultaneously with different owners.</w:t>
+        <w:t xml:space="preserve">The CFO should prioritise unlocking AED 16.5M in working capital as the immediate cash-flow action. The COO coordinates parallel tracks on expiry triage and stockout replenishment to protect margin. All three tracks run simultaneously with different owners.</w:t>
       </w:r>
     </w:p>
     <w:p>
@@ -1566,7 +1582,7 @@
           <w:sz w:val="20"/>
           <w:szCs w:val="20"/>
         </w:rPr>
-        <w:t xml:space="preserve"> (Python) computes every number: days of inventory, excess above order-up-to level, FEFO expiry risk, stockout shortfall, and value-at-stake rollup with overlap de-duplication. All calculations are tested against hand-verified fixtures across 84 automated tests.</w:t>
+        <w:t xml:space="preserve"> (Python) computes every number: days of inventory, excess above order-up-to level (with safety stock scaled to demand variability), FEFO expiry risk, stockout shortfall, and value-at-stake rollup. All calculations are tested against hand-verified fixtures across 88 automated tests.</w:t>
       </w:r>
     </w:p>
     <w:p>
@@ -1656,7 +1672,7 @@
           <w:sz w:val="20"/>
           <w:szCs w:val="20"/>
         </w:rPr>
-        <w:t xml:space="preserve">Inventory segmentation, periodic-review models, FEFO, service-level guardrails, and value-at-stake quantification at a level appropriate for client delivery in S&amp;O or transformation engagements.</w:t>
+        <w:t xml:space="preserve">Inventory segmentation, periodic-review models with variability-scaled safety stock, FEFO, service-level guardrails, and value-at-stake quantification at a level appropriate for client delivery in S&amp;O or transformation engagements.</w:t>
       </w:r>
     </w:p>
     <w:p>
@@ -2203,41 +2219,5 @@
       <w:szCs w:val="20"/>
     </w:rPr>
   </w:style>
-  <w:style w:type="paragraph" w:styleId="Heading1">
-    <w:name w:val="Heading 1"/>
-    <w:basedOn w:val="Normal"/>
-    <w:next w:val="Normal"/>
-    <w:qFormat/>
-    <w:pPr>
-      <w:spacing w:after="100" w:before="0"/>
-      <w:outlineLvl w:val="0"/>
-    </w:pPr>
-    <w:rPr>
-      <w:rFonts w:ascii="Arial" w:cs="Arial" w:eastAsia="Arial" w:hAnsi="Arial"/>
-      <w:b/>
-      <w:bCs/>
-      <w:color w:val="1B3A5C"/>
-      <w:sz w:val="32"/>
-      <w:szCs w:val="32"/>
-    </w:rPr>
-  </w:style>
-  <w:style w:type="paragraph" w:styleId="Heading2">
-    <w:name w:val="Heading 2"/>
-    <w:basedOn w:val="Normal"/>
-    <w:next w:val="Normal"/>
-    <w:qFormat/>
-    <w:pPr>
-      <w:spacing w:after="100" w:before="200"/>
-      <w:outlineLvl w:val="1"/>
-    </w:pPr>
-    <w:rPr>
-      <w:rFonts w:ascii="Arial" w:cs="Arial" w:eastAsia="Arial" w:hAnsi="Arial"/>
-      <w:b/>
-      <w:bCs/>
-      <w:color w:val="1B3A5C"/>
-      <w:sz w:val="24"/>
-      <w:szCs w:val="24"/>
-    </w:rPr>
-  </w:style>
 </w:styles>
 </file>
</xml_diff>